<commit_message>
chore: expand pre-commit checks and add schedule-case notebook notes
</commit_message>
<xml_diff>
--- a/.work/04.12 Idees.docx
+++ b/.work/04.12 Idees.docx
@@ -367,6 +367,79 @@
         </w:r>
       </w:hyperlink>
       <w:r>
+        <w:t xml:space="preserve"> </w:t>
+      </w:r>
+    </w:p>
+    <w:p/>
+    <w:p>
+      <w:pPr>
+        <w:rPr>
+          <w:rFonts w:ascii="Arial" w:hAnsi="Arial" w:cs="Arial"/>
+          <w:sz w:val="24"/>
+          <w:szCs w:val="24"/>
+        </w:rPr>
+      </w:pPr>
+      <w:r>
+        <w:rPr>
+          <w:rFonts w:ascii="Arial" w:hAnsi="Arial" w:cs="Arial"/>
+          <w:sz w:val="24"/>
+          <w:szCs w:val="24"/>
+        </w:rPr>
+        <w:t xml:space="preserve">Dades flux gent Barcelona: </w:t>
+      </w:r>
+      <w:hyperlink r:id="rId6" w:history="1">
+        <w:r>
+          <w:rPr>
+            <w:rStyle w:val="Hipervnculo"/>
+            <w:rFonts w:ascii="Arial" w:hAnsi="Arial" w:cs="Arial"/>
+            <w:sz w:val="24"/>
+            <w:szCs w:val="24"/>
+          </w:rPr>
+          <w:t>https://www.amb.cat/es/web/mobilitat/gestio-i-organitzacio/dades/dades-de-fluxos</w:t>
+        </w:r>
+      </w:hyperlink>
+      <w:r>
+        <w:rPr>
+          <w:rFonts w:ascii="Arial" w:hAnsi="Arial" w:cs="Arial"/>
+          <w:sz w:val="24"/>
+          <w:szCs w:val="24"/>
+        </w:rPr>
+        <w:t xml:space="preserve"> </w:t>
+      </w:r>
+    </w:p>
+    <w:p>
+      <w:pPr>
+        <w:rPr>
+          <w:rFonts w:ascii="Arial" w:hAnsi="Arial" w:cs="Arial"/>
+          <w:sz w:val="24"/>
+          <w:szCs w:val="24"/>
+        </w:rPr>
+      </w:pPr>
+      <w:r>
+        <w:rPr>
+          <w:rFonts w:ascii="Arial" w:hAnsi="Arial" w:cs="Arial"/>
+          <w:sz w:val="24"/>
+          <w:szCs w:val="24"/>
+        </w:rPr>
+        <w:t xml:space="preserve">Transport en xifres TMB </w:t>
+      </w:r>
+      <w:hyperlink r:id="rId7" w:history="1">
+        <w:r>
+          <w:rPr>
+            <w:rStyle w:val="Hipervnculo"/>
+            <w:rFonts w:ascii="Arial" w:hAnsi="Arial" w:cs="Arial"/>
+            <w:sz w:val="24"/>
+            <w:szCs w:val="24"/>
+          </w:rPr>
+          <w:t>https://www.tmb.cat/ca/coneix-tmb/informacio-corporativa/transport-xifres</w:t>
+        </w:r>
+      </w:hyperlink>
+      <w:r>
+        <w:rPr>
+          <w:rFonts w:ascii="Arial" w:hAnsi="Arial" w:cs="Arial"/>
+          <w:sz w:val="24"/>
+          <w:szCs w:val="24"/>
+        </w:rPr>
         <w:t xml:space="preserve"> </w:t>
       </w:r>
     </w:p>
@@ -1106,6 +1179,7 @@
   <w:style w:type="character" w:default="1" w:styleId="Fuentedeprrafopredeter">
     <w:name w:val="Default Paragraph Font"/>
     <w:uiPriority w:val="1"/>
+    <w:semiHidden/>
     <w:unhideWhenUsed/>
   </w:style>
   <w:style w:type="table" w:default="1" w:styleId="Tablanormal">

</xml_diff>